<commit_message>
Nr. 7 'Victoria' als 20-Minuten-Unisono-Block aufgenommen
Konzept des Dirigenten: alle singen die Melodie, mit Orchester, kein
vierstimmiger Satz. Passt zum Stueck, weil der Refrain dreimal wiederkehrt
und die Melodie sich selbst traegt.

Platzierung 11:30-11:50, direkt vor der Chorpause. Die 20 Minuten kommen aus
dem Vormittag: Nr. 6 von 41 auf 32, Nr. 4 von 37 auf 28 - beide bekannt und
damit weiter gut versorgt. Alles nach 11:50 bleibt unveraendert.

Vermerkt als Entscheidung mit Konsequenz: beim naechsten Kontakt muss angesagt
werden, dass der vierstimmige Satz folgt, sonst entsteht derselbe
Umlernwiderstand wie bei Nr. 9.

Probenmappe als PDF und Word neu gebaut (12 Seiten, acht Probenblaetter).

Co-Authored-By: Claude Opus 5 <noreply@anthropic.com>
Claude-Session: https://claude.ai/code/session_01GftfN2ZbR4hJMi8K4sLu7a
</commit_message>
<xml_diff>
--- a/probenplanung/04_Material/Probenmappe_2026-09-12_Laim.docx
+++ b/probenplanung/04_Material/Probenmappe_2026-09-12_Laim.docx
@@ -171,7 +171,7 @@
                 <w:sz w:val="21"/>
                 <w:szCs w:val="21"/>
               </w:rPr>
-              <w:t xml:space="preserve">308 min</w:t>
+              <w:t xml:space="preserve">310 min</w:t>
             </w:r>
           </w:p>
         </w:tc>
@@ -220,7 +220,7 @@
                 <w:sz w:val="21"/>
                 <w:szCs w:val="21"/>
               </w:rPr>
-              <w:t xml:space="preserve">308 min</w:t>
+              <w:t xml:space="preserve">310 min</w:t>
             </w:r>
           </w:p>
         </w:tc>
@@ -269,7 +269,7 @@
                 <w:sz w:val="21"/>
                 <w:szCs w:val="21"/>
               </w:rPr>
-              <w:t xml:space="preserve">7</w:t>
+              <w:t xml:space="preserve">8</w:t>
             </w:r>
           </w:p>
         </w:tc>
@@ -818,7 +818,7 @@
                 <w:sz w:val="18"/>
                 <w:szCs w:val="18"/>
               </w:rPr>
-              <w:t xml:space="preserve">10:27</w:t>
+              <w:t xml:space="preserve">10:25</w:t>
             </w:r>
           </w:p>
         </w:tc>
@@ -862,7 +862,7 @@
                 <w:sz w:val="18"/>
                 <w:szCs w:val="18"/>
               </w:rPr>
-              <w:t xml:space="preserve"> (41 Min.)</w:t>
+              <w:t xml:space="preserve"> (32 Min.)</w:t>
             </w:r>
           </w:p>
         </w:tc>
@@ -924,7 +924,7 @@
                 <w:sz w:val="18"/>
                 <w:szCs w:val="18"/>
               </w:rPr>
-              <w:t xml:space="preserve">11:08</w:t>
+              <w:t xml:space="preserve">10:57</w:t>
             </w:r>
           </w:p>
         </w:tc>
@@ -1030,7 +1030,7 @@
                 <w:sz w:val="18"/>
                 <w:szCs w:val="18"/>
               </w:rPr>
-              <w:t xml:space="preserve">11:13</w:t>
+              <w:t xml:space="preserve">11:02</w:t>
             </w:r>
           </w:p>
         </w:tc>
@@ -1074,7 +1074,113 @@
                 <w:sz w:val="18"/>
                 <w:szCs w:val="18"/>
               </w:rPr>
-              <w:t xml:space="preserve"> (37 Min.)</w:t>
+              <w:t xml:space="preserve"> (28 Min.)</w:t>
+            </w:r>
+          </w:p>
+        </w:tc>
+        <w:tc>
+          <w:tcPr>
+            <w:tcW w:type="dxa" w:w="4319"/>
+            <w:tcMar>
+              <w:top w:type="dxa" w:w="90"/>
+              <w:left w:type="dxa" w:w="130"/>
+              <w:bottom w:type="dxa" w:w="90"/>
+              <w:right w:type="dxa" w:w="130"/>
+            </w:tcMar>
+          </w:tcPr>
+          <w:p>
+            <w:pPr>
+              <w:spacing w:after="0" w:before="0" w:line="260"/>
+            </w:pPr>
+            <w:r>
+              <w:rPr>
+                <w:rFonts w:ascii="Calibri" w:cs="Calibri" w:eastAsia="Calibri" w:hAnsi="Calibri"/>
+                <w:b w:val="false"/>
+                <w:bCs w:val="false"/>
+                <w:i w:val="false"/>
+                <w:iCs w:val="false"/>
+                <w:caps w:val="false"/>
+                <w:color w:val="231B27"/>
+                <w:sz w:val="18"/>
+                <w:szCs w:val="18"/>
+              </w:rPr>
+              <w:t xml:space="preserve">dabei</w:t>
+            </w:r>
+          </w:p>
+        </w:tc>
+      </w:tr>
+      <w:tr>
+        <w:tc>
+          <w:tcPr>
+            <w:tcW w:type="dxa" w:w="1000"/>
+            <w:tcMar>
+              <w:top w:type="dxa" w:w="90"/>
+              <w:left w:type="dxa" w:w="130"/>
+              <w:bottom w:type="dxa" w:w="90"/>
+              <w:right w:type="dxa" w:w="130"/>
+            </w:tcMar>
+          </w:tcPr>
+          <w:p>
+            <w:pPr>
+              <w:spacing w:after="0" w:before="0" w:line="260"/>
+            </w:pPr>
+            <w:r>
+              <w:rPr>
+                <w:rFonts w:ascii="Consolas" w:cs="Consolas" w:eastAsia="Consolas" w:hAnsi="Consolas"/>
+                <w:b/>
+                <w:bCs/>
+                <w:i w:val="false"/>
+                <w:iCs w:val="false"/>
+                <w:caps w:val="false"/>
+                <w:color w:val="231B27"/>
+                <w:sz w:val="18"/>
+                <w:szCs w:val="18"/>
+              </w:rPr>
+              <w:t xml:space="preserve">11:30</w:t>
+            </w:r>
+          </w:p>
+        </w:tc>
+        <w:tc>
+          <w:tcPr>
+            <w:tcW w:type="dxa" w:w="4319"/>
+            <w:tcMar>
+              <w:top w:type="dxa" w:w="90"/>
+              <w:left w:type="dxa" w:w="130"/>
+              <w:bottom w:type="dxa" w:w="90"/>
+              <w:right w:type="dxa" w:w="130"/>
+            </w:tcMar>
+          </w:tcPr>
+          <w:p>
+            <w:pPr>
+              <w:spacing w:after="0" w:before="0" w:line="260"/>
+            </w:pPr>
+            <w:r>
+              <w:rPr>
+                <w:rFonts w:ascii="Calibri" w:cs="Calibri" w:eastAsia="Calibri" w:hAnsi="Calibri"/>
+                <w:b/>
+                <w:bCs/>
+                <w:i w:val="false"/>
+                <w:iCs w:val="false"/>
+                <w:caps w:val="false"/>
+                <w:color w:val="231B27"/>
+                <w:sz w:val="18"/>
+                <w:szCs w:val="18"/>
+              </w:rPr>
+              <w:t xml:space="preserve">Nr. 7 — Victoria, my Jesus lives!</w:t>
+            </w:r>
+            <w:r>
+              <w:rPr>
+                <w:rFonts w:ascii="Calibri" w:cs="Calibri" w:eastAsia="Calibri" w:hAnsi="Calibri"/>
+                <w:b w:val="false"/>
+                <w:bCs w:val="false"/>
+                <w:i w:val="false"/>
+                <w:iCs w:val="false"/>
+                <w:caps w:val="false"/>
+                <w:color w:val="231B27"/>
+                <w:sz w:val="18"/>
+                <w:szCs w:val="18"/>
+              </w:rPr>
+              <w:t xml:space="preserve"> (20 Min.) · alle auf der Melodie</w:t>
             </w:r>
           </w:p>
         </w:tc>
@@ -2005,6 +2111,34 @@
           <w:sz w:val="19"/>
           <w:szCs w:val="19"/>
         </w:rPr>
+        <w:t xml:space="preserve">Woher die 20 Minuten für Nr. 7 kommen: </w:t>
+      </w:r>
+      <w:r>
+        <w:rPr>
+          <w:rFonts w:ascii="Calibri" w:cs="Calibri" w:eastAsia="Calibri" w:hAnsi="Calibri"/>
+          <w:b w:val="false"/>
+          <w:bCs w:val="false"/>
+          <w:i w:val="false"/>
+          <w:iCs w:val="false"/>
+          <w:caps w:val="false"/>
+          <w:color w:val="231B27"/>
+          <w:sz w:val="19"/>
+          <w:szCs w:val="19"/>
+        </w:rPr>
+        <w:t xml:space="preserve">aus dem Vormittag. Nr. 6 gibt neun Minuten ab (41 → 32), Nr. 4 neun (37 → 28). Beide sind bekannt und bleiben damit gut versorgt. Alles nach 11:50 bleibt unverändert. </w:t>
+      </w:r>
+      <w:r>
+        <w:rPr>
+          <w:rFonts w:ascii="Calibri" w:cs="Calibri" w:eastAsia="Calibri" w:hAnsi="Calibri"/>
+          <w:b/>
+          <w:bCs/>
+          <w:i w:val="false"/>
+          <w:iCs w:val="false"/>
+          <w:caps w:val="false"/>
+          <w:color w:val="231B27"/>
+          <w:sz w:val="19"/>
+          <w:szCs w:val="19"/>
+        </w:rPr>
         <w:t xml:space="preserve">Fünf Minuten Umbau in jedem Wechsel. </w:t>
       </w:r>
       <w:r>
@@ -2046,7 +2180,7 @@
           <w:sz w:val="19"/>
           <w:szCs w:val="19"/>
         </w:rPr>
-        <w:t xml:space="preserve">308 Minuten Chorgesang — der eine ernste Punkt am Plan. </w:t>
+        <w:t xml:space="preserve">310 Minuten Chorgesang — der eine ernste Punkt am Plan. </w:t>
       </w:r>
       <w:r>
         <w:rPr>
@@ -2951,7 +3085,7 @@
                 <w:sz w:val="17"/>
                 <w:szCs w:val="17"/>
               </w:rPr>
-              <w:t xml:space="preserve">10:27 · 41 Min. · zusammen</w:t>
+              <w:t xml:space="preserve">10:25 · 32 Min. · zusammen</w:t>
             </w:r>
           </w:p>
         </w:tc>
@@ -3389,7 +3523,7 @@
                 <w:sz w:val="18"/>
                 <w:szCs w:val="18"/>
               </w:rPr>
-              <w:t xml:space="preserve">Handzeichen: wer kennt es? Danach die 41 Minuten neu verteilen</w:t>
+              <w:t xml:space="preserve">Handzeichen: wer kennt es? Danach die 32 Minuten neu verteilen</w:t>
             </w:r>
           </w:p>
         </w:tc>
@@ -3937,7 +4071,7 @@
                 <w:sz w:val="17"/>
                 <w:szCs w:val="17"/>
               </w:rPr>
-              <w:t xml:space="preserve">11:13 · 37 Min. · zusammen</w:t>
+              <w:t xml:space="preserve">11:02 · 28 Min. · zusammen</w:t>
             </w:r>
           </w:p>
         </w:tc>
@@ -4841,6 +4975,992 @@
           <w:szCs w:val="19"/>
         </w:rPr>
         <w:t xml:space="preserve">Wir singen das nicht neu, wir wiegen es neu. Mit 220 Stimmen ist dasselbe Stück ein anderes Stück.</w:t>
+      </w:r>
+    </w:p>
+    <w:p>
+      <w:r>
+        <w:br w:type="page"/>
+      </w:r>
+    </w:p>
+    <w:tbl>
+      <w:tblPr>
+        <w:tblW w:type="dxa" w:w="9638"/>
+        <w:tblBorders>
+          <w:top w:val="none" w:color="FFFFFF" w:sz="0"/>
+          <w:left w:val="none" w:color="FFFFFF" w:sz="0"/>
+          <w:bottom w:val="none" w:color="FFFFFF" w:sz="0"/>
+          <w:right w:val="none" w:color="FFFFFF" w:sz="0"/>
+          <w:insideH w:val="none" w:color="FFFFFF" w:sz="0"/>
+          <w:insideV w:val="none" w:color="FFFFFF" w:sz="0"/>
+        </w:tblBorders>
+      </w:tblPr>
+      <w:tblGrid>
+        <w:gridCol w:w="6000"/>
+        <w:gridCol w:w="3638"/>
+      </w:tblGrid>
+      <w:tr>
+        <w:tc>
+          <w:tcPr>
+            <w:tcW w:type="dxa" w:w="6000"/>
+            <w:tcMar>
+              <w:top w:type="dxa" w:w="90"/>
+              <w:left w:type="dxa" w:w="130"/>
+              <w:bottom w:type="dxa" w:w="90"/>
+              <w:right w:type="dxa" w:w="130"/>
+            </w:tcMar>
+          </w:tcPr>
+          <w:p>
+            <w:pPr>
+              <w:spacing w:after="0" w:before="0" w:line="260"/>
+            </w:pPr>
+            <w:r>
+              <w:rPr>
+                <w:rFonts w:ascii="Consolas" w:cs="Consolas" w:eastAsia="Consolas" w:hAnsi="Consolas"/>
+                <w:b/>
+                <w:bCs/>
+                <w:i w:val="false"/>
+                <w:iCs w:val="false"/>
+                <w:caps/>
+                <w:color w:val="7A2C63"/>
+                <w:spacing w:val="20"/>
+                <w:sz w:val="15"/>
+                <w:szCs w:val="15"/>
+              </w:rPr>
+              <w:t xml:space="preserve">Nr. 7 · Wirksamkeit</w:t>
+            </w:r>
+          </w:p>
+        </w:tc>
+        <w:tc>
+          <w:tcPr>
+            <w:tcW w:type="dxa" w:w="3638"/>
+            <w:tcMar>
+              <w:top w:type="dxa" w:w="90"/>
+              <w:left w:type="dxa" w:w="130"/>
+              <w:bottom w:type="dxa" w:w="90"/>
+              <w:right w:type="dxa" w:w="130"/>
+            </w:tcMar>
+          </w:tcPr>
+          <w:p>
+            <w:pPr>
+              <w:spacing w:after="0" w:before="0" w:line="260"/>
+              <w:jc w:val="right"/>
+            </w:pPr>
+            <w:r>
+              <w:rPr>
+                <w:rFonts w:ascii="Consolas" w:cs="Consolas" w:eastAsia="Consolas" w:hAnsi="Consolas"/>
+                <w:b/>
+                <w:bCs/>
+                <w:i w:val="false"/>
+                <w:iCs w:val="false"/>
+                <w:caps w:val="false"/>
+                <w:color w:val="584C5D"/>
+                <w:sz w:val="17"/>
+                <w:szCs w:val="17"/>
+              </w:rPr>
+              <w:t xml:space="preserve">11:30 · 20 Min. · zusammen</w:t>
+            </w:r>
+          </w:p>
+        </w:tc>
+      </w:tr>
+    </w:tbl>
+    <w:p>
+      <w:pPr>
+        <w:pStyle w:val="Heading2"/>
+        <w:spacing w:after="30" w:before="40"/>
+      </w:pPr>
+      <w:r>
+        <w:rPr>
+          <w:rFonts w:ascii="Cambria" w:cs="Cambria" w:eastAsia="Cambria" w:hAnsi="Cambria"/>
+          <w:b/>
+          <w:bCs/>
+          <w:color w:val="231B27"/>
+          <w:sz w:val="32"/>
+          <w:szCs w:val="32"/>
+        </w:rPr>
+        <w:t xml:space="preserve">Victoria, my Jesus lives!</w:t>
+      </w:r>
+    </w:p>
+    <w:p>
+      <w:pPr>
+        <w:spacing w:after="60" w:before="0" w:line="260"/>
+      </w:pPr>
+      <w:r>
+        <w:rPr>
+          <w:rFonts w:ascii="Calibri" w:cs="Calibri" w:eastAsia="Calibri" w:hAnsi="Calibri"/>
+          <w:b w:val="false"/>
+          <w:bCs w:val="false"/>
+          <w:i w:val="false"/>
+          <w:iCs w:val="false"/>
+          <w:caps w:val="false"/>
+          <w:color w:val="584C5D"/>
+          <w:sz w:val="18"/>
+          <w:szCs w:val="18"/>
+        </w:rPr>
+        <w:t xml:space="preserve">John Rodriques · Text Samuel Medley · NAC South Africa, © 2024</w:t>
+      </w:r>
+    </w:p>
+    <w:tbl>
+      <w:tblPr>
+        <w:tblW w:type="dxa" w:w="9638"/>
+        <w:tblBorders>
+          <w:top w:val="single" w:color="CFC1CF" w:sz="4"/>
+          <w:left w:val="none" w:color="FFFFFF" w:sz="0"/>
+          <w:bottom w:val="single" w:color="CFC1CF" w:sz="4"/>
+          <w:right w:val="none" w:color="FFFFFF" w:sz="0"/>
+          <w:insideH w:val="single" w:color="E2D8E2" w:sz="4"/>
+          <w:insideV w:val="none" w:color="FFFFFF" w:sz="0"/>
+        </w:tblBorders>
+      </w:tblPr>
+      <w:tblGrid>
+        <w:gridCol w:w="9638"/>
+      </w:tblGrid>
+      <w:tr>
+        <w:tc>
+          <w:tcPr>
+            <w:tcW w:type="dxa" w:w="9638"/>
+            <w:shd w:fill="F3EEF2" w:val="clear"/>
+            <w:tcMar>
+              <w:top w:type="dxa" w:w="90"/>
+              <w:left w:type="dxa" w:w="130"/>
+              <w:bottom w:type="dxa" w:w="90"/>
+              <w:right w:type="dxa" w:w="130"/>
+            </w:tcMar>
+          </w:tcPr>
+          <w:p>
+            <w:pPr>
+              <w:spacing w:after="0" w:before="0" w:line="260"/>
+            </w:pPr>
+            <w:r>
+              <w:rPr>
+                <w:rFonts w:ascii="Consolas" w:cs="Consolas" w:eastAsia="Consolas" w:hAnsi="Consolas"/>
+                <w:b w:val="false"/>
+                <w:bCs w:val="false"/>
+                <w:i w:val="false"/>
+                <w:iCs w:val="false"/>
+                <w:caps w:val="false"/>
+                <w:color w:val="584C5D"/>
+                <w:sz w:val="17"/>
+                <w:szCs w:val="17"/>
+              </w:rPr>
+              <w:t xml:space="preserve">ca. 53 Takte   ·   ♩ = 62   ·   G-Dur   ·   ca. 3:25   ·   heute: alle auf der Melodie</w:t>
+            </w:r>
+          </w:p>
+        </w:tc>
+      </w:tr>
+    </w:tbl>
+    <w:p>
+      <w:pPr>
+        <w:spacing w:after="40" w:before="0" w:line="260"/>
+      </w:pPr>
+      <w:r>
+        <w:rPr>
+          <w:rFonts w:ascii="Calibri" w:cs="Calibri" w:eastAsia="Calibri" w:hAnsi="Calibri"/>
+          <w:b w:val="false"/>
+          <w:bCs w:val="false"/>
+          <w:i w:val="false"/>
+          <w:iCs w:val="false"/>
+          <w:caps w:val="false"/>
+          <w:color w:val="231B27"/>
+          <w:sz w:val="6"/>
+          <w:szCs w:val="6"/>
+        </w:rPr>
+        <w:t xml:space="preserve"/>
+      </w:r>
+    </w:p>
+    <w:tbl>
+      <w:tblPr>
+        <w:tblW w:type="dxa" w:w="9638"/>
+        <w:tblBorders>
+          <w:top w:val="single" w:color="CFC1CF" w:sz="4"/>
+          <w:left w:val="none" w:color="FFFFFF" w:sz="0"/>
+          <w:bottom w:val="single" w:color="CFC1CF" w:sz="4"/>
+          <w:right w:val="none" w:color="FFFFFF" w:sz="0"/>
+          <w:insideH w:val="single" w:color="E2D8E2" w:sz="4"/>
+          <w:insideV w:val="single" w:color="E2D8E2" w:sz="4"/>
+        </w:tblBorders>
+      </w:tblPr>
+      <w:tblGrid>
+        <w:gridCol w:w="4819"/>
+        <w:gridCol w:w="4819"/>
+      </w:tblGrid>
+      <w:tr>
+        <w:tc>
+          <w:tcPr>
+            <w:tcW w:type="dxa" w:w="4819"/>
+            <w:tcMar>
+              <w:top w:type="dxa" w:w="90"/>
+              <w:left w:type="dxa" w:w="130"/>
+              <w:bottom w:type="dxa" w:w="90"/>
+              <w:right w:type="dxa" w:w="130"/>
+            </w:tcMar>
+          </w:tcPr>
+          <w:p>
+            <w:pPr>
+              <w:spacing w:after="60" w:before="0" w:line="260"/>
+            </w:pPr>
+            <w:r>
+              <w:rPr>
+                <w:rFonts w:ascii="Consolas" w:cs="Consolas" w:eastAsia="Consolas" w:hAnsi="Consolas"/>
+                <w:b/>
+                <w:bCs/>
+                <w:i w:val="false"/>
+                <w:iCs w:val="false"/>
+                <w:caps/>
+                <w:color w:val="7A2C63"/>
+                <w:spacing w:val="20"/>
+                <w:sz w:val="15"/>
+                <w:szCs w:val="15"/>
+              </w:rPr>
+              <w:t xml:space="preserve">Chor</w:t>
+            </w:r>
+          </w:p>
+          <w:p>
+            <w:pPr>
+              <w:spacing w:after="20" w:before="0" w:line="260"/>
+            </w:pPr>
+            <w:r>
+              <w:rPr>
+                <w:rFonts w:ascii="Consolas" w:cs="Consolas" w:eastAsia="Consolas" w:hAnsi="Consolas"/>
+                <w:b/>
+                <w:bCs/>
+                <w:i w:val="false"/>
+                <w:iCs w:val="false"/>
+                <w:caps w:val="false"/>
+                <w:color w:val="584C5D"/>
+                <w:sz w:val="16"/>
+                <w:szCs w:val="16"/>
+              </w:rPr>
+              <w:t xml:space="preserve">Konzept</w:t>
+            </w:r>
+          </w:p>
+          <w:p>
+            <w:pPr>
+              <w:spacing w:after="20" w:before="0" w:line="260"/>
+            </w:pPr>
+            <w:r>
+              <w:rPr>
+                <w:rFonts w:ascii="Calibri" w:cs="Calibri" w:eastAsia="Calibri" w:hAnsi="Calibri"/>
+                <w:b/>
+                <w:bCs/>
+                <w:i w:val="false"/>
+                <w:iCs w:val="false"/>
+                <w:caps w:val="false"/>
+                <w:color w:val="231B27"/>
+                <w:sz w:val="18"/>
+                <w:szCs w:val="18"/>
+              </w:rPr>
+              <w:t xml:space="preserve">Alle singen die Melodie im Unisono — kein vierstimmiger Satz</w:t>
+            </w:r>
+          </w:p>
+          <w:p>
+            <w:pPr>
+              <w:spacing w:after="0" w:before="0" w:line="260"/>
+            </w:pPr>
+            <w:r>
+              <w:rPr>
+                <w:rFonts w:ascii="Calibri" w:cs="Calibri" w:eastAsia="Calibri" w:hAnsi="Calibri"/>
+                <w:b/>
+                <w:bCs/>
+                <w:i w:val="false"/>
+                <w:iCs w:val="false"/>
+                <w:caps w:val="false"/>
+                <w:color w:val="7A2C63"/>
+                <w:sz w:val="18"/>
+                <w:szCs w:val="18"/>
+              </w:rPr>
+              <w:t xml:space="preserve">→ </w:t>
+            </w:r>
+            <w:r>
+              <w:rPr>
+                <w:rFonts w:ascii="Calibri" w:cs="Calibri" w:eastAsia="Calibri" w:hAnsi="Calibri"/>
+                <w:b w:val="false"/>
+                <w:bCs w:val="false"/>
+                <w:i w:val="false"/>
+                <w:iCs w:val="false"/>
+                <w:caps w:val="false"/>
+                <w:color w:val="584C5D"/>
+                <w:sz w:val="18"/>
+                <w:szCs w:val="18"/>
+              </w:rPr>
+              <w:t xml:space="preserve">Ohne Noten. Vorsingen, nachsingen. Bei 250 Menschen schneller als jedes Notenlesen — und es hebt die Köpfe</w:t>
+            </w:r>
+          </w:p>
+          <w:p>
+            <w:pPr>
+              <w:spacing w:after="20" w:before="110" w:line="260"/>
+            </w:pPr>
+            <w:r>
+              <w:rPr>
+                <w:rFonts w:ascii="Consolas" w:cs="Consolas" w:eastAsia="Consolas" w:hAnsi="Consolas"/>
+                <w:b/>
+                <w:bCs/>
+                <w:i w:val="false"/>
+                <w:iCs w:val="false"/>
+                <w:caps w:val="false"/>
+                <w:color w:val="584C5D"/>
+                <w:sz w:val="16"/>
+                <w:szCs w:val="16"/>
+              </w:rPr>
+              <w:t xml:space="preserve">T. 13–20</w:t>
+            </w:r>
+          </w:p>
+          <w:p>
+            <w:pPr>
+              <w:spacing w:after="20" w:before="0" w:line="260"/>
+            </w:pPr>
+            <w:r>
+              <w:rPr>
+                <w:rFonts w:ascii="Calibri" w:cs="Calibri" w:eastAsia="Calibri" w:hAnsi="Calibri"/>
+                <w:b/>
+                <w:bCs/>
+                <w:i w:val="false"/>
+                <w:iCs w:val="false"/>
+                <w:caps w:val="false"/>
+                <w:color w:val="231B27"/>
+                <w:sz w:val="18"/>
+                <w:szCs w:val="18"/>
+              </w:rPr>
+              <w:t xml:space="preserve">Refrain „Victoria! My Jesus lives!“</w:t>
+            </w:r>
+          </w:p>
+          <w:p>
+            <w:pPr>
+              <w:spacing w:after="0" w:before="0" w:line="260"/>
+            </w:pPr>
+            <w:r>
+              <w:rPr>
+                <w:rFonts w:ascii="Calibri" w:cs="Calibri" w:eastAsia="Calibri" w:hAnsi="Calibri"/>
+                <w:b/>
+                <w:bCs/>
+                <w:i w:val="false"/>
+                <w:iCs w:val="false"/>
+                <w:caps w:val="false"/>
+                <w:color w:val="7A2C63"/>
+                <w:sz w:val="18"/>
+                <w:szCs w:val="18"/>
+              </w:rPr>
+              <w:t xml:space="preserve">→ </w:t>
+            </w:r>
+            <w:r>
+              <w:rPr>
+                <w:rFonts w:ascii="Calibri" w:cs="Calibri" w:eastAsia="Calibri" w:hAnsi="Calibri"/>
+                <w:b w:val="false"/>
+                <w:bCs w:val="false"/>
+                <w:i w:val="false"/>
+                <w:iCs w:val="false"/>
+                <w:caps w:val="false"/>
+                <w:color w:val="584C5D"/>
+                <w:sz w:val="18"/>
+                <w:szCs w:val="18"/>
+              </w:rPr>
+              <w:t xml:space="preserve">Hier anfangen. Der Refrain kehrt dreimal wieder — wer ihn hat, hat das halbe Stück</w:t>
+            </w:r>
+          </w:p>
+          <w:p>
+            <w:pPr>
+              <w:spacing w:after="20" w:before="110" w:line="260"/>
+            </w:pPr>
+            <w:r>
+              <w:rPr>
+                <w:rFonts w:ascii="Consolas" w:cs="Consolas" w:eastAsia="Consolas" w:hAnsi="Consolas"/>
+                <w:b/>
+                <w:bCs/>
+                <w:i w:val="false"/>
+                <w:iCs w:val="false"/>
+                <w:caps w:val="false"/>
+                <w:color w:val="584C5D"/>
+                <w:sz w:val="16"/>
+                <w:szCs w:val="16"/>
+              </w:rPr>
+              <w:t xml:space="preserve">T. 29–41</w:t>
+            </w:r>
+          </w:p>
+          <w:p>
+            <w:pPr>
+              <w:spacing w:after="20" w:before="0" w:line="260"/>
+            </w:pPr>
+            <w:r>
+              <w:rPr>
+                <w:rFonts w:ascii="Calibri" w:cs="Calibri" w:eastAsia="Calibri" w:hAnsi="Calibri"/>
+                <w:b/>
+                <w:bCs/>
+                <w:i w:val="false"/>
+                <w:iCs w:val="false"/>
+                <w:caps w:val="false"/>
+                <w:color w:val="231B27"/>
+                <w:sz w:val="18"/>
+                <w:szCs w:val="18"/>
+              </w:rPr>
+              <w:t xml:space="preserve">Derselbe Refrain im zweiten Durchgang</w:t>
+            </w:r>
+          </w:p>
+          <w:p>
+            <w:pPr>
+              <w:spacing w:after="0" w:before="0" w:line="260"/>
+            </w:pPr>
+            <w:r>
+              <w:rPr>
+                <w:rFonts w:ascii="Calibri" w:cs="Calibri" w:eastAsia="Calibri" w:hAnsi="Calibri"/>
+                <w:b/>
+                <w:bCs/>
+                <w:i w:val="false"/>
+                <w:iCs w:val="false"/>
+                <w:caps w:val="false"/>
+                <w:color w:val="7A2C63"/>
+                <w:sz w:val="18"/>
+                <w:szCs w:val="18"/>
+              </w:rPr>
+              <w:t xml:space="preserve">→ </w:t>
+            </w:r>
+            <w:r>
+              <w:rPr>
+                <w:rFonts w:ascii="Calibri" w:cs="Calibri" w:eastAsia="Calibri" w:hAnsi="Calibri"/>
+                <w:b w:val="false"/>
+                <w:bCs w:val="false"/>
+                <w:i w:val="false"/>
+                <w:iCs w:val="false"/>
+                <w:caps w:val="false"/>
+                <w:color w:val="584C5D"/>
+                <w:sz w:val="18"/>
+                <w:szCs w:val="18"/>
+              </w:rPr>
+              <w:t xml:space="preserve">Ausdrücklich sagen, dass es dieselbe Melodie ist. Das spart die halbe Zeit</w:t>
+            </w:r>
+          </w:p>
+          <w:p>
+            <w:pPr>
+              <w:spacing w:after="20" w:before="110" w:line="260"/>
+            </w:pPr>
+            <w:r>
+              <w:rPr>
+                <w:rFonts w:ascii="Consolas" w:cs="Consolas" w:eastAsia="Consolas" w:hAnsi="Consolas"/>
+                <w:b/>
+                <w:bCs/>
+                <w:i w:val="false"/>
+                <w:iCs w:val="false"/>
+                <w:caps w:val="false"/>
+                <w:color w:val="584C5D"/>
+                <w:sz w:val="16"/>
+                <w:szCs w:val="16"/>
+              </w:rPr>
+              <w:t xml:space="preserve">T. 47–53</w:t>
+            </w:r>
+          </w:p>
+          <w:p>
+            <w:pPr>
+              <w:spacing w:after="20" w:before="0" w:line="260"/>
+            </w:pPr>
+            <w:r>
+              <w:rPr>
+                <w:rFonts w:ascii="Calibri" w:cs="Calibri" w:eastAsia="Calibri" w:hAnsi="Calibri"/>
+                <w:b/>
+                <w:bCs/>
+                <w:i w:val="false"/>
+                <w:iCs w:val="false"/>
+                <w:caps w:val="false"/>
+                <w:color w:val="231B27"/>
+                <w:sz w:val="18"/>
+                <w:szCs w:val="18"/>
+              </w:rPr>
+              <w:t xml:space="preserve">rall. und rit. in den Schluss</w:t>
+            </w:r>
+          </w:p>
+          <w:p>
+            <w:pPr>
+              <w:spacing w:after="0" w:before="0" w:line="260"/>
+            </w:pPr>
+            <w:r>
+              <w:rPr>
+                <w:rFonts w:ascii="Calibri" w:cs="Calibri" w:eastAsia="Calibri" w:hAnsi="Calibri"/>
+                <w:b/>
+                <w:bCs/>
+                <w:i w:val="false"/>
+                <w:iCs w:val="false"/>
+                <w:caps w:val="false"/>
+                <w:color w:val="7A2C63"/>
+                <w:sz w:val="18"/>
+                <w:szCs w:val="18"/>
+              </w:rPr>
+              <w:t xml:space="preserve">→ </w:t>
+            </w:r>
+            <w:r>
+              <w:rPr>
+                <w:rFonts w:ascii="Calibri" w:cs="Calibri" w:eastAsia="Calibri" w:hAnsi="Calibri"/>
+                <w:b w:val="false"/>
+                <w:bCs w:val="false"/>
+                <w:i w:val="false"/>
+                <w:iCs w:val="false"/>
+                <w:caps w:val="false"/>
+                <w:color w:val="584C5D"/>
+                <w:sz w:val="18"/>
+                <w:szCs w:val="18"/>
+              </w:rPr>
+              <w:t xml:space="preserve">Dehnung verabreden und mit dem Orchester koppeln</w:t>
+            </w:r>
+          </w:p>
+        </w:tc>
+        <w:tc>
+          <w:tcPr>
+            <w:tcW w:type="dxa" w:w="4819"/>
+            <w:tcMar>
+              <w:top w:type="dxa" w:w="90"/>
+              <w:left w:type="dxa" w:w="130"/>
+              <w:bottom w:type="dxa" w:w="90"/>
+              <w:right w:type="dxa" w:w="130"/>
+            </w:tcMar>
+          </w:tcPr>
+          <w:p>
+            <w:pPr>
+              <w:spacing w:after="60" w:before="0" w:line="260"/>
+            </w:pPr>
+            <w:r>
+              <w:rPr>
+                <w:rFonts w:ascii="Consolas" w:cs="Consolas" w:eastAsia="Consolas" w:hAnsi="Consolas"/>
+                <w:b/>
+                <w:bCs/>
+                <w:i w:val="false"/>
+                <w:iCs w:val="false"/>
+                <w:caps/>
+                <w:color w:val="3F6F9F"/>
+                <w:spacing w:val="20"/>
+                <w:sz w:val="15"/>
+                <w:szCs w:val="15"/>
+              </w:rPr>
+              <w:t xml:space="preserve">Orchester</w:t>
+            </w:r>
+          </w:p>
+          <w:p>
+            <w:pPr>
+              <w:spacing w:after="20" w:before="0" w:line="260"/>
+            </w:pPr>
+            <w:r>
+              <w:rPr>
+                <w:rFonts w:ascii="Consolas" w:cs="Consolas" w:eastAsia="Consolas" w:hAnsi="Consolas"/>
+                <w:b/>
+                <w:bCs/>
+                <w:i w:val="false"/>
+                <w:iCs w:val="false"/>
+                <w:caps w:val="false"/>
+                <w:color w:val="584C5D"/>
+                <w:sz w:val="16"/>
+                <w:szCs w:val="16"/>
+              </w:rPr>
+              <w:t xml:space="preserve">zu Beginn</w:t>
+            </w:r>
+          </w:p>
+          <w:p>
+            <w:pPr>
+              <w:spacing w:after="20" w:before="0" w:line="260"/>
+            </w:pPr>
+            <w:r>
+              <w:rPr>
+                <w:rFonts w:ascii="Calibri" w:cs="Calibri" w:eastAsia="Calibri" w:hAnsi="Calibri"/>
+                <w:b/>
+                <w:bCs/>
+                <w:i w:val="false"/>
+                <w:iCs w:val="false"/>
+                <w:caps w:val="false"/>
+                <w:color w:val="231B27"/>
+                <w:sz w:val="18"/>
+                <w:szCs w:val="18"/>
+              </w:rPr>
+              <w:t xml:space="preserve">Einmal ganz durch, während der Chor nur hört</w:t>
+            </w:r>
+          </w:p>
+          <w:p>
+            <w:pPr>
+              <w:spacing w:after="0" w:before="0" w:line="260"/>
+            </w:pPr>
+            <w:r>
+              <w:rPr>
+                <w:rFonts w:ascii="Calibri" w:cs="Calibri" w:eastAsia="Calibri" w:hAnsi="Calibri"/>
+                <w:b/>
+                <w:bCs/>
+                <w:i w:val="false"/>
+                <w:iCs w:val="false"/>
+                <w:caps w:val="false"/>
+                <w:color w:val="3F6F9F"/>
+                <w:sz w:val="18"/>
+                <w:szCs w:val="18"/>
+              </w:rPr>
+              <w:t xml:space="preserve">→ </w:t>
+            </w:r>
+            <w:r>
+              <w:rPr>
+                <w:rFonts w:ascii="Calibri" w:cs="Calibri" w:eastAsia="Calibri" w:hAnsi="Calibri"/>
+                <w:b w:val="false"/>
+                <w:bCs w:val="false"/>
+                <w:i w:val="false"/>
+                <w:iCs w:val="false"/>
+                <w:caps w:val="false"/>
+                <w:color w:val="584C5D"/>
+                <w:sz w:val="18"/>
+                <w:szCs w:val="18"/>
+              </w:rPr>
+              <w:t xml:space="preserve">Drei Minuten, die keine Chorstimme kosten — und der Chor lernt die Melodie durchs Zuhören</w:t>
+            </w:r>
+          </w:p>
+          <w:p>
+            <w:pPr>
+              <w:spacing w:after="20" w:before="110" w:line="260"/>
+            </w:pPr>
+            <w:r>
+              <w:rPr>
+                <w:rFonts w:ascii="Consolas" w:cs="Consolas" w:eastAsia="Consolas" w:hAnsi="Consolas"/>
+                <w:b/>
+                <w:bCs/>
+                <w:i w:val="false"/>
+                <w:iCs w:val="false"/>
+                <w:caps w:val="false"/>
+                <w:color w:val="584C5D"/>
+                <w:sz w:val="16"/>
+                <w:szCs w:val="16"/>
+              </w:rPr>
+              <w:t xml:space="preserve">T. 17–20</w:t>
+            </w:r>
+          </w:p>
+          <w:p>
+            <w:pPr>
+              <w:spacing w:after="20" w:before="0" w:line="260"/>
+            </w:pPr>
+            <w:r>
+              <w:rPr>
+                <w:rFonts w:ascii="Calibri" w:cs="Calibri" w:eastAsia="Calibri" w:hAnsi="Calibri"/>
+                <w:b/>
+                <w:bCs/>
+                <w:i w:val="false"/>
+                <w:iCs w:val="false"/>
+                <w:caps w:val="false"/>
+                <w:color w:val="231B27"/>
+                <w:sz w:val="18"/>
+                <w:szCs w:val="18"/>
+              </w:rPr>
+              <w:t xml:space="preserve">Streicher pizzicato, ab T. 21 wieder arco</w:t>
+            </w:r>
+          </w:p>
+          <w:p>
+            <w:pPr>
+              <w:spacing w:after="0" w:before="0" w:line="260"/>
+            </w:pPr>
+            <w:r>
+              <w:rPr>
+                <w:rFonts w:ascii="Calibri" w:cs="Calibri" w:eastAsia="Calibri" w:hAnsi="Calibri"/>
+                <w:b/>
+                <w:bCs/>
+                <w:i w:val="false"/>
+                <w:iCs w:val="false"/>
+                <w:caps w:val="false"/>
+                <w:color w:val="3F6F9F"/>
+                <w:sz w:val="18"/>
+                <w:szCs w:val="18"/>
+              </w:rPr>
+              <w:t xml:space="preserve">→ </w:t>
+            </w:r>
+            <w:r>
+              <w:rPr>
+                <w:rFonts w:ascii="Calibri" w:cs="Calibri" w:eastAsia="Calibri" w:hAnsi="Calibri"/>
+                <w:b w:val="false"/>
+                <w:bCs w:val="false"/>
+                <w:i w:val="false"/>
+                <w:iCs w:val="false"/>
+                <w:caps w:val="false"/>
+                <w:color w:val="584C5D"/>
+                <w:sz w:val="18"/>
+                <w:szCs w:val="18"/>
+              </w:rPr>
+              <w:t xml:space="preserve">Wechsel markieren</w:t>
+            </w:r>
+          </w:p>
+          <w:p>
+            <w:pPr>
+              <w:spacing w:after="20" w:before="110" w:line="260"/>
+            </w:pPr>
+            <w:r>
+              <w:rPr>
+                <w:rFonts w:ascii="Consolas" w:cs="Consolas" w:eastAsia="Consolas" w:hAnsi="Consolas"/>
+                <w:b/>
+                <w:bCs/>
+                <w:i w:val="false"/>
+                <w:iCs w:val="false"/>
+                <w:caps w:val="false"/>
+                <w:color w:val="584C5D"/>
+                <w:sz w:val="16"/>
+                <w:szCs w:val="16"/>
+              </w:rPr>
+              <w:t xml:space="preserve">T. 37–41</w:t>
+            </w:r>
+          </w:p>
+          <w:p>
+            <w:pPr>
+              <w:spacing w:after="20" w:before="0" w:line="260"/>
+            </w:pPr>
+            <w:r>
+              <w:rPr>
+                <w:rFonts w:ascii="Calibri" w:cs="Calibri" w:eastAsia="Calibri" w:hAnsi="Calibri"/>
+                <w:b/>
+                <w:bCs/>
+                <w:i w:val="false"/>
+                <w:iCs w:val="false"/>
+                <w:caps w:val="false"/>
+                <w:color w:val="231B27"/>
+                <w:sz w:val="18"/>
+                <w:szCs w:val="18"/>
+              </w:rPr>
+              <w:t xml:space="preserve">Beckenwirbel und Schlägelschlag</w:t>
+            </w:r>
+          </w:p>
+          <w:p>
+            <w:pPr>
+              <w:spacing w:after="0" w:before="0" w:line="260"/>
+            </w:pPr>
+            <w:r>
+              <w:rPr>
+                <w:rFonts w:ascii="Calibri" w:cs="Calibri" w:eastAsia="Calibri" w:hAnsi="Calibri"/>
+                <w:b/>
+                <w:bCs/>
+                <w:i w:val="false"/>
+                <w:iCs w:val="false"/>
+                <w:caps w:val="false"/>
+                <w:color w:val="3F6F9F"/>
+                <w:sz w:val="18"/>
+                <w:szCs w:val="18"/>
+              </w:rPr>
+              <w:t xml:space="preserve">→ </w:t>
+            </w:r>
+            <w:r>
+              <w:rPr>
+                <w:rFonts w:ascii="Calibri" w:cs="Calibri" w:eastAsia="Calibri" w:hAnsi="Calibri"/>
+                <w:b w:val="false"/>
+                <w:bCs w:val="false"/>
+                <w:i w:val="false"/>
+                <w:iCs w:val="false"/>
+                <w:caps w:val="false"/>
+                <w:color w:val="584C5D"/>
+                <w:sz w:val="18"/>
+                <w:szCs w:val="18"/>
+              </w:rPr>
+              <w:t xml:space="preserve">Die Steigerung des Stücks — heute schon anlegen</w:t>
+            </w:r>
+          </w:p>
+          <w:p>
+            <w:pPr>
+              <w:spacing w:after="20" w:before="110" w:line="260"/>
+            </w:pPr>
+            <w:r>
+              <w:rPr>
+                <w:rFonts w:ascii="Consolas" w:cs="Consolas" w:eastAsia="Consolas" w:hAnsi="Consolas"/>
+                <w:b/>
+                <w:bCs/>
+                <w:i w:val="false"/>
+                <w:iCs w:val="false"/>
+                <w:caps w:val="false"/>
+                <w:color w:val="584C5D"/>
+                <w:sz w:val="16"/>
+                <w:szCs w:val="16"/>
+              </w:rPr>
+              <w:t xml:space="preserve">Besetzung</w:t>
+            </w:r>
+          </w:p>
+          <w:p>
+            <w:pPr>
+              <w:spacing w:after="20" w:before="0" w:line="260"/>
+            </w:pPr>
+            <w:r>
+              <w:rPr>
+                <w:rFonts w:ascii="Calibri" w:cs="Calibri" w:eastAsia="Calibri" w:hAnsi="Calibri"/>
+                <w:b/>
+                <w:bCs/>
+                <w:i w:val="false"/>
+                <w:iCs w:val="false"/>
+                <w:caps w:val="false"/>
+                <w:color w:val="231B27"/>
+                <w:sz w:val="18"/>
+                <w:szCs w:val="18"/>
+              </w:rPr>
+              <w:t xml:space="preserve">Oboe, 4 Hörner, 2 Trompeten, 3 Posaunen, Pauken, Becken, Harfe, Klavier, Streicher</w:t>
+            </w:r>
+          </w:p>
+          <w:p>
+            <w:pPr>
+              <w:spacing w:after="0" w:before="0" w:line="260"/>
+            </w:pPr>
+            <w:r>
+              <w:rPr>
+                <w:rFonts w:ascii="Calibri" w:cs="Calibri" w:eastAsia="Calibri" w:hAnsi="Calibri"/>
+                <w:b/>
+                <w:bCs/>
+                <w:i w:val="false"/>
+                <w:iCs w:val="false"/>
+                <w:caps w:val="false"/>
+                <w:color w:val="3F6F9F"/>
+                <w:sz w:val="18"/>
+                <w:szCs w:val="18"/>
+              </w:rPr>
+              <w:t xml:space="preserve">→ </w:t>
+            </w:r>
+            <w:r>
+              <w:rPr>
+                <w:rFonts w:ascii="Calibri" w:cs="Calibri" w:eastAsia="Calibri" w:hAnsi="Calibri"/>
+                <w:b w:val="false"/>
+                <w:bCs w:val="false"/>
+                <w:i w:val="false"/>
+                <w:iCs w:val="false"/>
+                <w:caps w:val="false"/>
+                <w:color w:val="584C5D"/>
+                <w:sz w:val="18"/>
+                <w:szCs w:val="18"/>
+              </w:rPr>
+              <w:t xml:space="preserve">Harfe auf dem Klavier — zweiter Tastenspieler nötig</w:t>
+            </w:r>
+          </w:p>
+        </w:tc>
+      </w:tr>
+    </w:tbl>
+    <w:p>
+      <w:pPr>
+        <w:spacing w:after="60" w:before="0" w:line="260"/>
+      </w:pPr>
+      <w:r>
+        <w:rPr>
+          <w:rFonts w:ascii="Calibri" w:cs="Calibri" w:eastAsia="Calibri" w:hAnsi="Calibri"/>
+          <w:b w:val="false"/>
+          <w:bCs w:val="false"/>
+          <w:i w:val="false"/>
+          <w:iCs w:val="false"/>
+          <w:caps w:val="false"/>
+          <w:color w:val="231B27"/>
+          <w:sz w:val="6"/>
+          <w:szCs w:val="6"/>
+        </w:rPr>
+        <w:t xml:space="preserve"/>
+      </w:r>
+    </w:p>
+    <w:p>
+      <w:pPr>
+        <w:spacing w:after="60" w:before="0" w:line="260"/>
+      </w:pPr>
+      <w:r>
+        <w:rPr>
+          <w:rFonts w:ascii="Consolas" w:cs="Consolas" w:eastAsia="Consolas" w:hAnsi="Consolas"/>
+          <w:b/>
+          <w:bCs/>
+          <w:i w:val="false"/>
+          <w:iCs w:val="false"/>
+          <w:caps/>
+          <w:color w:val="231B27"/>
+          <w:spacing w:val="20"/>
+          <w:sz w:val="15"/>
+          <w:szCs w:val="15"/>
+        </w:rPr>
+        <w:t xml:space="preserve">Der Zweck des Blocks</w:t>
+      </w:r>
+    </w:p>
+    <w:p>
+      <w:pPr>
+        <w:spacing w:after="70" w:before="0" w:line="260"/>
+      </w:pPr>
+      <w:r>
+        <w:rPr>
+          <w:rFonts w:ascii="Calibri" w:cs="Calibri" w:eastAsia="Calibri" w:hAnsi="Calibri"/>
+          <w:b/>
+          <w:bCs/>
+          <w:i w:val="false"/>
+          <w:iCs w:val="false"/>
+          <w:caps w:val="false"/>
+          <w:color w:val="231B27"/>
+          <w:sz w:val="19"/>
+          <w:szCs w:val="19"/>
+        </w:rPr>
+        <w:t xml:space="preserve">250 Stimmen unisono über vollem Orchester.</w:t>
+      </w:r>
+      <w:r>
+        <w:rPr>
+          <w:rFonts w:ascii="Calibri" w:cs="Calibri" w:eastAsia="Calibri" w:hAnsi="Calibri"/>
+          <w:b w:val="false"/>
+          <w:bCs w:val="false"/>
+          <w:i w:val="false"/>
+          <w:iCs w:val="false"/>
+          <w:caps w:val="false"/>
+          <w:color w:val="231B27"/>
+          <w:sz w:val="19"/>
+          <w:szCs w:val="19"/>
+        </w:rPr>
+        <w:t xml:space="preserve"> Das ist der Klang, mit dem die Leute in die Pause gehen — und bei ♩ = 62 ist es ein Hymnus, kein Schnellschuss. Vokal kostet es fast nichts, weil niemand eine Nebenstimme halten muss.</w:t>
+      </w:r>
+    </w:p>
+    <w:p>
+      <w:pPr>
+        <w:spacing w:after="70" w:before="0" w:line="260"/>
+      </w:pPr>
+      <w:r>
+        <w:rPr>
+          <w:rFonts w:ascii="Calibri" w:cs="Calibri" w:eastAsia="Calibri" w:hAnsi="Calibri"/>
+          <w:b/>
+          <w:bCs/>
+          <w:i w:val="false"/>
+          <w:iCs w:val="false"/>
+          <w:caps w:val="false"/>
+          <w:color w:val="231B27"/>
+          <w:sz w:val="19"/>
+          <w:szCs w:val="19"/>
+        </w:rPr>
+        <w:t xml:space="preserve">Achtung für später:</w:t>
+      </w:r>
+      <w:r>
+        <w:rPr>
+          <w:rFonts w:ascii="Calibri" w:cs="Calibri" w:eastAsia="Calibri" w:hAnsi="Calibri"/>
+          <w:b w:val="false"/>
+          <w:bCs w:val="false"/>
+          <w:i w:val="false"/>
+          <w:iCs w:val="false"/>
+          <w:caps w:val="false"/>
+          <w:color w:val="231B27"/>
+          <w:sz w:val="19"/>
+          <w:szCs w:val="19"/>
+        </w:rPr>
+        <w:t xml:space="preserve"> Wenn heute alle die Melodie singen, muss die Ansage kommen, dass beim nächsten Mal der vierstimmige Satz folgt — sonst entsteht derselbe Umlernwiderstand wie bei Nr. 9.</w:t>
+      </w:r>
+    </w:p>
+    <w:p>
+      <w:pPr>
+        <w:pBdr>
+          <w:top w:val="none" w:color="FFFFFF" w:sz="0"/>
+          <w:bottom w:val="none" w:color="FFFFFF" w:sz="0"/>
+          <w:left w:val="single" w:color="9C7728" w:sz="18"/>
+          <w:right w:val="none" w:color="FFFFFF" w:sz="0"/>
+        </w:pBdr>
+        <w:shd w:fill="F4EFE4" w:val="clear"/>
+        <w:spacing w:after="140" w:before="100" w:line="260"/>
+        <w:ind w:left="140" w:right="140"/>
+      </w:pPr>
+      <w:r>
+        <w:rPr>
+          <w:rFonts w:ascii="Consolas" w:cs="Consolas" w:eastAsia="Consolas" w:hAnsi="Consolas"/>
+          <w:b/>
+          <w:bCs/>
+          <w:i w:val="false"/>
+          <w:iCs w:val="false"/>
+          <w:caps/>
+          <w:color w:val="9C7728"/>
+          <w:spacing w:val="20"/>
+          <w:sz w:val="17"/>
+          <w:szCs w:val="17"/>
+        </w:rPr>
+        <w:t xml:space="preserve">Ein Satz für den Chor — </w:t>
+      </w:r>
+      <w:r>
+        <w:rPr>
+          <w:rFonts w:ascii="Calibri" w:cs="Calibri" w:eastAsia="Calibri" w:hAnsi="Calibri"/>
+          <w:b w:val="false"/>
+          <w:bCs w:val="false"/>
+          <w:i w:val="false"/>
+          <w:iCs w:val="false"/>
+          <w:caps w:val="false"/>
+          <w:color w:val="231B27"/>
+          <w:sz w:val="19"/>
+          <w:szCs w:val="19"/>
+        </w:rPr>
+        <w:t xml:space="preserve">Heute singen alle dieselbe Melodie. Beim nächsten Mal teilen wir sie auf — merkt euch das schon mal.</w:t>
       </w:r>
     </w:p>
     <w:p>

</xml_diff>